<commit_message>
Archaic words: write results from the pilot test, add defense deck
The test section and hypothesis now report the 7 real participants as
a preliminary result; all numbers regenerate from the workbook.

Co-Authored-By: Claude Opus 5.5 <noreply@anthropic.com>
Claude-Session: https://claude.ai/code/session_01GWp2V469ega9rMmDw4DHEN
</commit_message>
<xml_diff>
--- a/Zerde_Konergen_sozder/Zertteu_zhumysy.docx
+++ b/Zerde_Konergen_sozder/Zertteu_zhumysy.docx
@@ -311,28 +311,7 @@
           <w:sz w:val="28"/>
           <w:szCs w:val="28"/>
         </w:rPr>
-        <w:t xml:space="preserve">Жұмыстың мақсаты – көнерген сөздердің түсіндірме сөздіктегі белгісін, бүгінгі баспасөздегі қолданысын және үш буынның оларды білуін зерттеу. Өзектілігі: тәуелсіздік жылдары кейбір көне сөздер («әкім», «теңге», «Мәжіліс») тілге қайта оралды, ал кейбірі ұмыт болып барады. Зерттеу сұрағы: көнерген сөздер бүгін қайда және қандай мағынада қолданылады және оларды әр буын қаншалықты біледі? Болжам: қайта қолданысқа енген архаизмдер сөздікте көнерген деп белгіленбеген, тарихи сөздердің көбі белгіленген, ал көне сөздерді ата-әжелер оқушылардан жақсы біледі. Әдістер: сөздікпен тексеру, БАҚ мониторингі, үш буынға сөз тану тесті, салыстыру. Алты тақырыптық топтан алынған 36 көнерген сөз «Қазақ әдеби тілінің сөздігі» бойынша тексерілді, әскери топтағы 4 сөз egemen.kz сайтында бақыланды, 12 сөз бойынша үш буынға тест жүргізілді. </w:t>
-      </w:r>
-      <w:r>
-        <w:rPr>
-          <w:rFonts w:ascii="Times New Roman" w:cs="Times New Roman" w:eastAsia="Times New Roman" w:hAnsi="Times New Roman"/>
-          <w:b w:val="false"/>
-          <w:bCs w:val="false"/>
-          <w:sz w:val="28"/>
-          <w:szCs w:val="28"/>
-          <w:highlight w:val="yellow"/>
-        </w:rPr>
-        <w:t xml:space="preserve">[Негізгі нәтижелерді 2–3 сөйлеммен жазыңыз.]</w:t>
-      </w:r>
-      <w:r>
-        <w:rPr>
-          <w:rFonts w:ascii="Times New Roman" w:cs="Times New Roman" w:eastAsia="Times New Roman" w:hAnsi="Times New Roman"/>
-          <w:b w:val="false"/>
-          <w:bCs w:val="false"/>
-          <w:sz w:val="28"/>
-          <w:szCs w:val="28"/>
-        </w:rPr>
-        <w:t xml:space="preserve"> Нәтижесінде «Көне сөз – жаңа тыныс» мини-сөздігі жасалды.</w:t>
+        <w:t xml:space="preserve">Жұмыстың мақсаты – көнерген сөздердің түсіндірме сөздіктегі белгісін, бүгінгі баспасөздегі қолданысын және үш буынның оларды білуін зерттеу. Өзектілігі: тәуелсіздік жылдары кейбір көне сөздер («әкім», «теңге», «Мәжіліс») тілге қайта оралды, ал кейбірі ұмыт болып барады. Зерттеу сұрағы: көнерген сөздер бүгін қайда және қандай мағынада қолданылады және оларды әр буын қаншалықты біледі? Болжам: қайта қолданысқа енген архаизмдер сөздікте көнерген деп белгіленбеген, тарихи сөздердің көбі белгіленген, ал көне сөздерді ата-әжелер оқушылардан жақсы біледі. Әдістер: сөздікпен тексеру, БАҚ мониторингі, үш буынға сөз тану тесті, салыстыру. Алты тақырыптық топтан алынған 36 көнерген сөз «Қазақ әдеби тілінің сөздігі» бойынша тексерілді, әскери топтағы 4 сөз egemen.kz сайтында бақыланды, 12 сөз бойынша үш буынға тест жүргізілді. Түсіндірме сөздікте 36 сөздің 19-ында «көнерген» не «тарихи» белгісі жоқ, әсіресе қайта жанданған архаизмдерде. Алдын ала тестте көне сөздерді дұрыс түсіндіру үлесі оқушыларда 44,4%, ата-аналарда 75%, ата-әжелерде 58,3% болды. Болжамым ішінара расталды. Нәтижесінде «Көне сөз – жаңа тыныс» мини-сөздігі жасалды.</w:t>
       </w:r>
     </w:p>
     <w:p>
@@ -738,7 +717,7 @@
           <w:sz w:val="28"/>
           <w:szCs w:val="28"/>
         </w:rPr>
-        <w:t xml:space="preserve">	14</w:t>
+        <w:t xml:space="preserve">	15</w:t>
       </w:r>
     </w:p>
     <w:p>
@@ -762,7 +741,7 @@
           <w:sz w:val="28"/>
           <w:szCs w:val="28"/>
         </w:rPr>
-        <w:t xml:space="preserve">	15</w:t>
+        <w:t xml:space="preserve">	16</w:t>
       </w:r>
     </w:p>
     <w:p>
@@ -786,7 +765,7 @@
           <w:sz w:val="28"/>
           <w:szCs w:val="28"/>
         </w:rPr>
-        <w:t xml:space="preserve">	16</w:t>
+        <w:t xml:space="preserve">	17</w:t>
       </w:r>
     </w:p>
     <w:p>
@@ -810,7 +789,7 @@
           <w:sz w:val="28"/>
           <w:szCs w:val="28"/>
         </w:rPr>
-        <w:t xml:space="preserve">	17</w:t>
+        <w:t xml:space="preserve">	18</w:t>
       </w:r>
     </w:p>
     <w:p>
@@ -834,7 +813,7 @@
           <w:sz w:val="28"/>
           <w:szCs w:val="28"/>
         </w:rPr>
-        <w:t xml:space="preserve">	18</w:t>
+        <w:t xml:space="preserve">	19</w:t>
       </w:r>
     </w:p>
     <w:p>
@@ -858,7 +837,7 @@
           <w:sz w:val="28"/>
           <w:szCs w:val="28"/>
         </w:rPr>
-        <w:t xml:space="preserve">	19</w:t>
+        <w:t xml:space="preserve">	20</w:t>
       </w:r>
     </w:p>
     <w:p>
@@ -3732,7 +3711,7 @@
           <w:sz w:val="28"/>
           <w:szCs w:val="28"/>
         </w:rPr>
-        <w:t xml:space="preserve"> Әр тақырыптық топтан екі сөз алып, барлығы 12 сөзден тест құрастырдық (Ә қосымшасы). Тестке үш буын қатысты: оқушылар, ата-аналар және ата-әжелер, әр буыннан 6 адамнан. Әр қатысушыдан сөздің мағынасын түсіндіріп беруін сұрадым: 2 – дұрыс түсіндірді, 1 – шамамен түсіндірді, 0 – білмейді. Сосын «Бұл сөзді соңғы бір жылда естідіңіз бе немесе өзіңіз қолдандыңыз ба?» деп сұрадым. Мен сөздің мағынасын айтып көмектеспедім.</w:t>
+        <w:t xml:space="preserve"> Әр тақырыптық топтан екі сөз алып, барлығы 12 сөзден тест құрастырдық (Ә қосымшасы). Тест үш буынға арналды: оқушылар, ата-аналар және ата-әжелер. Әзірге тестке 7 адам қатысты: 5 оқушы, 1 ата-ана және 1 ата-әже. Әр қатысушыдан сөздің мағынасын түсіндіріп беруін сұрадым: 2 – дұрыс түсіндірді, 1 – шамамен түсіндірді, 0 – білмейді. Сосын «Бұл сөзді соңғы бір жылда естідіңіз бе немесе өзіңіз қолдандыңыз ба?» деп сұрадым. Мен сөздің мағынасын айтып көмектеспедім.</w:t>
       </w:r>
     </w:p>
     <w:p>
@@ -4989,9 +4968,8 @@
           <w:bCs w:val="false"/>
           <w:sz w:val="28"/>
           <w:szCs w:val="28"/>
-          <w:highlight w:val="yellow"/>
-        </w:rPr>
-        <w:t xml:space="preserve">[Үш буынның нәтижесін салыстырыңыз.]</w:t>
+        </w:rPr>
+        <w:t xml:space="preserve">Тестті алдымен 7 адамға жүргіздім: 5 оқушы, 1 ата-ана және 1 ата-әже. Сондықтан бұл – алдын ала нәтиже. Көне сөздерді дұрыс түсіндіру үлесі оқушыларда 44,4%, ата-аналарда 75%, ата-әжелерде 58,3% болды (5-кесте, 5-сурет). «Сарбаз», «тиын» және «тұлпар» сөздерін барлық буын дұрыс түсіндірді. Бұл сөздер бүгін де жиі айтылады және сөздікте көнерген деп белгіленбеген. Ал «болыс», «батпан», «кебенек» және «тамұқ» сөздерін бірде-бір оқушы дұрыс түсіндірмеді, бірақ үлкендердің ішінде оларды білетіндер болды.</w:t>
       </w:r>
     </w:p>
     <w:p>
@@ -7109,18 +7087,7 @@
           <w:sz w:val="28"/>
           <w:szCs w:val="28"/>
         </w:rPr>
-        <w:t xml:space="preserve">Болжамымды үш бөлік бойынша тексердім. Біріншіден, 19 архаизмнің 13-інде сөздікте ешқандай белгі жоқ – яғни бүгін қолданылатын архаизмдердің көбі сөздікте көнерген деп белгіленбеген, болжамның бұл бөлігі расталды. Екіншіден, 17 тарихи сөздің 10-і «көн.» не «тар.» деп белгіленген – бұл бөлігі де расталды, бірақ 6 тарихи сөзде белгі жоқ. </w:t>
-      </w:r>
-      <w:r>
-        <w:rPr>
-          <w:rFonts w:ascii="Times New Roman" w:cs="Times New Roman" w:eastAsia="Times New Roman" w:hAnsi="Times New Roman"/>
-          <w:b w:val="false"/>
-          <w:bCs w:val="false"/>
-          <w:sz w:val="28"/>
-          <w:szCs w:val="28"/>
-          <w:highlight w:val="yellow"/>
-        </w:rPr>
-        <w:t xml:space="preserve">[Үшінші бөлігі – буындардың нәтижесі – тест аяқталғаннан кейін жазылады.]</w:t>
+        <w:t xml:space="preserve">Болжамымды үш бөлік бойынша тексердім. Біріншіден, 19 архаизмнің 13-інде сөздікте ешқандай белгі жоқ – яғни бүгін қолданылатын архаизмдердің көбі сөздікте көнерген деп белгіленбеген, болжамның бұл бөлігі расталды. Екіншіден, 17 тарихи сөздің 10-ы «көн.» не «тар.» деп белгіленген – бұл бөлігі де расталды, бірақ 6 тарихи сөзде белгі жоқ. Үшіншіден, алдын ала тестте көне сөздерді дұрыс түсіндіру үлесі оқушыларда 44,4%, ата-аналарда 75%, ата-әжелерде 58,3% болды. Оқушылар шынымен ең нашар білді, бірақ ата-әжелер ата-аналардан жоғары нәтиже көрсетпеді, сондықтан бұл бөлігі ішінара расталды. Ата-ана мен ата-әжеден аз адам қатысқандықтан, бұл нәтижені алдын ала деп есептеймін. Болжамым ішінара расталды.</w:t>
       </w:r>
     </w:p>
     <w:p>
@@ -7154,7 +7121,7 @@
           <w:sz w:val="28"/>
           <w:szCs w:val="28"/>
         </w:rPr>
-        <w:t xml:space="preserve">Зерттеуімнің шектеулері де бар. Біріншіден, Google көрсететін нәтиже саны шамамен ғана беріледі. Сонымен қатар іздеу сөздің тек сол тұлғасын табады: «сауыт» деп іздегенде «сауыттың», «сауытты» деген тұлғалар толық шықпауы мүмкін. Екіншіден, БАҚ мониторингін тек бір газеттің сайтында және тек 4 сөзге жүргіздім, сондықтан ол басқа топтардағы сөздердің бүгінгі қолданысын толық көрсетпейді. Үшіншіден, тестке әр буыннан аз адам қатысты, сондықтан нәтижені барлық адамға жалпылауға болмайды.</w:t>
+        <w:t xml:space="preserve">Зерттеуімнің шектеулері де бар. Біріншіден, Google көрсететін нәтиже саны шамамен ғана беріледі. Сонымен қатар іздеу сөздің тек сол тұлғасын табады: «сауыт» деп іздегенде «сауыттың», «сауытты» деген тұлғалар толық шықпауы мүмкін. Екіншіден, БАҚ мониторингін тек бір газеттің сайтында және тек 4 сөзге жүргіздім, сондықтан ол басқа топтардағы сөздердің бүгінгі қолданысын толық көрсетпейді. Үшіншіден, тестке аз адам қатысты, әсіресе ата-аналар мен ата-әжелерден, сондықтан нәтижені барлық адамға жалпылауға болмайды.</w:t>
       </w:r>
     </w:p>
     <w:p>
@@ -7389,9 +7356,8 @@
           <w:bCs w:val="false"/>
           <w:sz w:val="28"/>
           <w:szCs w:val="28"/>
-          <w:highlight w:val="yellow"/>
-        </w:rPr>
-        <w:t xml:space="preserve">[Тест бойынша қорытынды.]</w:t>
+        </w:rPr>
+        <w:t xml:space="preserve">Алдын ала тест (7 адам) көрсеткендей, оқушылар көне сөздердің 44,4%-ын дұрыс түсіндірді, ал ата-аналарда бұл көрсеткіш 75%, ата-әжелерде 58,3%. Бүгін жиі қолданылатын сөздерді («сарбаз», «тиын» және «тұлпар») барлық буын біледі.</w:t>
       </w:r>
     </w:p>
     <w:p>
@@ -7418,18 +7384,7 @@
           <w:sz w:val="28"/>
           <w:szCs w:val="28"/>
         </w:rPr>
-        <w:t xml:space="preserve"> </w:t>
-      </w:r>
-      <w:r>
-        <w:rPr>
-          <w:rFonts w:ascii="Times New Roman" w:cs="Times New Roman" w:eastAsia="Times New Roman" w:hAnsi="Times New Roman"/>
-          <w:b w:val="false"/>
-          <w:bCs w:val="false"/>
-          <w:sz w:val="28"/>
-          <w:szCs w:val="28"/>
-          <w:highlight w:val="yellow"/>
-        </w:rPr>
-        <w:t xml:space="preserve">[Болжам расталды / ішінара расталды / расталмады.]</w:t>
+        <w:t xml:space="preserve"> Болжамым ішінара расталды.</w:t>
       </w:r>
     </w:p>
     <w:p>
@@ -7483,7 +7438,7 @@
           <w:sz w:val="28"/>
           <w:szCs w:val="28"/>
         </w:rPr>
-        <w:t xml:space="preserve"> БАҚ мониторингі бір газеттің сайтында, тек 4 сөзге жүргізілді, іздеу нәтижесі шамамен ғана; тестке әр буыннан 6 адам қатысты.</w:t>
+        <w:t xml:space="preserve"> БАҚ мониторингі бір газеттің сайтында, тек 4 сөзге жүргізілді, іздеу нәтижесі шамамен ғана; тестке 7 адам ғана қатысты, сондықтан тест нәтижесі алдын ала нәтиже ғана.</w:t>
       </w:r>
     </w:p>
     <w:p>
@@ -7532,7 +7487,7 @@
     </w:p>
     <w:p>
       <w:pPr>
-        <w:spacing w:after="120" w:before="60" w:line="276"/>
+        <w:spacing w:after="0" w:before="0" w:line="360"/>
         <w:ind w:firstLine="709"/>
         <w:jc w:val="both"/>
       </w:pPr>
@@ -7541,11 +7496,10 @@
           <w:rFonts w:ascii="Times New Roman" w:cs="Times New Roman" w:eastAsia="Times New Roman" w:hAnsi="Times New Roman"/>
           <w:b w:val="false"/>
           <w:bCs w:val="false"/>
-          <w:sz w:val="24"/>
-          <w:szCs w:val="24"/>
-          <w:highlight w:val="yellow"/>
-        </w:rPr>
-        <w:t xml:space="preserve">НҰСҚАУ (тапсыру алдында өшіріледі): Рефлексияны зерттеу аяқталған соң өз сөзіңізбен жазыңыз: зерттеуде не қызық болды, не қиын болды, нені басқаша істер едіңіз (5–7 сөйлем).</w:t>
+          <w:sz w:val="28"/>
+          <w:szCs w:val="28"/>
+        </w:rPr>
+        <w:t xml:space="preserve">Жобаны бастағанда мен көнерген сөздер тілден мүлде шығып кеткен деп ойлаған едім. Ал сөздікті ашқанда, көнерген деп жүрген сөздердің жартысынан көбі сөздікте қарапайым сөз ретінде берілгенін көріп, таңғалдым. Маған ең қызығы «дулыға» сөзін дзюдо турнирінің атауынан табу болды: ескі соғыс киімінің атауы спортта жаңа өмір тапты. Ең қиыны – тестке адам жинау болды, әсіресе ата-әжелерден. Сонымен қатар Google көрсететін нәтиже санының дәл еместігін және іздеу сөздің тек бір тұлғасын табатынын түсіндім. Бұл жұмыс маған сөздікпен жұмыс істеуді, деректерді кестеге жинап санауды үйретті. Келесі жолы мен тестке көбірек адам қатыстырып, БАҚ мониторингін барлық сөзге жүргізер едім.</w:t>
       </w:r>
     </w:p>
     <w:p>

</xml_diff>